<commit_message>
Normalize supervisor name throughout current repository
Apply the researcher's explicit naming correction to text, report generators and 11 Word/PDF report pairs. Preserve all 62 results files and original frozen manifests. Record exact before/after editorial hashes and refresh current report checksums. Keep Git history and release tags intact. No new experiment or scientific result change.
</commit_message>
<xml_diff>
--- a/deliverables/phase17_research_report_fa.docx
+++ b/deliverables/phase17_research_report_fa.docx
@@ -132,7 +132,7 @@
           <w:rtl w:val="1"/>
           <w:lang w:val="fa-IR" w:bidi="fa-IR"/>
         </w:rPr>
-        <w:t>استاد راهنمای دانشگاهی: استاد امیر نوری ولنده</w:t>
+        <w:t>استاد راهنمای دانشگاهی: استاد امیر نوری</w:t>
       </w:r>
     </w:p>
     <w:p>
@@ -4473,7 +4473,7 @@
           <w:rtl w:val="1"/>
           <w:lang w:val="fa-IR" w:bidi="fa-IR"/>
         </w:rPr>
-        <w:t xml:space="preserve">از استاد امیر نوری ولنده، راهنمای دانشگاهی پروژه، برای هدایت علمی و پشتیبانی از ایده‌های نو سپاسگزارم. از دکتر آرش فکری، استاد من در علوم اعصاب شناختی و بنیان‌گذار </w:t>
+        <w:t xml:space="preserve">از استاد امیر نوری، راهنمای دانشگاهی پروژه، برای هدایت علمی و پشتیبانی از ایده‌های نو سپاسگزارم. از دکتر آرش فکری، استاد من در علوم اعصاب شناختی و بنیان‌گذار </w:t>
       </w:r>
       <w:r>
         <w:rPr>

</xml_diff>